<commit_message>
Mark all fixtures as synthetic, ahead of a public push
fixtures/ contains invented vendor policies and a fake questionnaire
with no real-world provenance. Before this repo is pushed publicly,
every fixture file needs to say so plainly so it can't be mistaken for
a real organization's documents by anyone who finds it out of context.
Added a visible notice to the top of the markdown evidence file, a body
paragraph plus generator-script docstring note for the DOCX evidence
file, and workbook properties + an A1 cell comment for the xlsx
questionnaire (chosen over inserting a banner row so the existing row
numbers - already exercised throughout manual testing - don't shift).

Co-Authored-By: Claude Sonnet 5 <noreply@anthropic.com>
</commit_message>
<xml_diff>
--- a/fixtures/evidence/business_continuity_plan.docx
+++ b/fixtures/evidence/business_continuity_plan.docx
@@ -2,6 +2,11 @@
 <file path=word/document.xml><?xml version="1.0" encoding="utf-8"?>
 <w:document xmlns:wpc="http://schemas.microsoft.com/office/word/2010/wordprocessingCanvas" xmlns:mo="http://schemas.microsoft.com/office/mac/office/2008/main" xmlns:mc="http://schemas.openxmlformats.org/markup-compatibility/2006" xmlns:mv="urn:schemas-microsoft-com:mac:vml" xmlns:o="urn:schemas-microsoft-com:office:office" xmlns:r="http://schemas.openxmlformats.org/officeDocument/2006/relationships" xmlns:m="http://schemas.openxmlformats.org/officeDocument/2006/math" xmlns:v="urn:schemas-microsoft-com:vml" xmlns:wp14="http://schemas.microsoft.com/office/word/2010/wordprocessingDrawing" xmlns:wp="http://schemas.openxmlformats.org/drawingml/2006/wordprocessingDrawing" xmlns:w10="urn:schemas-microsoft-com:office:word" xmlns:w="http://schemas.openxmlformats.org/wordprocessingml/2006/main" xmlns:w14="http://schemas.microsoft.com/office/word/2010/wordml" xmlns:wpg="http://schemas.microsoft.com/office/word/2010/wordprocessingGroup" xmlns:wpi="http://schemas.microsoft.com/office/word/2010/wordprocessingInk" xmlns:wne="http://schemas.microsoft.com/office/word/2006/wordml" xmlns:wps="http://schemas.microsoft.com/office/word/2010/wordprocessingShape" mc:Ignorable="w14 wp14">
   <w:body>
+    <w:p>
+      <w:r>
+        <w:t>SYNTHETIC TEST FIXTURE — NOT A REAL DOCUMENT. This file was invented for this project's test fixtures. It does not describe the policies of any real organization and must not be treated as evidence about any company's actual security controls.</w:t>
+      </w:r>
+    </w:p>
     <w:p>
       <w:pPr>
         <w:pStyle w:val="Heading1"/>

</xml_diff>